<commit_message>
Add recorded-voiceover Ancile Aeris v2.1 reviewer video
- render_recorded_voiceover_v21_video.py builds the MP4 around the checked-in WAV timing source
- artifacts/video_v21 includes the recorded-narration MP4, source WAV, and 15 keyframes
- submission package index, production package, and checklist now identify this as the primary reviewer video

Co-authored-by: Cursor <cursoragent@cursor.com>
</commit_message>
<xml_diff>
--- a/submission/LRBAA_Submission_Package_v2.1.docx
+++ b/submission/LRBAA_Submission_Package_v2.1.docx
@@ -352,13 +352,13 @@
       </w:r>
     </w:p>
     <w:bookmarkEnd w:id="14"/>
-    <w:bookmarkStart w:id="21" w:name="video-400-demo"/>
+    <w:bookmarkStart w:id="21" w:name="video"/>
     <w:p>
       <w:pPr>
         <w:pStyle w:val="Heading2"/>
       </w:pPr>
       <w:r>
-        <w:t xml:space="preserve">Video (4:00 demo)</w:t>
+        <w:t xml:space="preserve">Video</w:t>
       </w:r>
     </w:p>
     <w:tbl>
@@ -534,6 +534,118 @@
                 <w:t xml:space="preserve">.docx</w:t>
               </w:r>
             </w:hyperlink>
+          </w:p>
+        </w:tc>
+      </w:tr>
+      <w:tr>
+        <w:tc>
+          <w:tcPr/>
+          <w:p>
+            <w:pPr>
+              <w:pStyle w:val="Compact"/>
+            </w:pPr>
+            <w:r>
+              <w:rPr>
+                <w:b/>
+                <w:bCs/>
+              </w:rPr>
+              <w:t xml:space="preserve">Primary reviewer video with recorded narration</w:t>
+            </w:r>
+          </w:p>
+        </w:tc>
+        <w:tc>
+          <w:tcPr/>
+          <w:p>
+            <w:pPr>
+              <w:pStyle w:val="Compact"/>
+            </w:pPr>
+            <w:r>
+              <w:rPr>
+                <w:rStyle w:val="VerbatimChar"/>
+              </w:rPr>
+              <w:t xml:space="preserve">artifacts/video_v21/Ancile_Aeris_v2.1_LRBAA_BORAP_04_recorded_voiceover_demo.mp4</w:t>
+            </w:r>
+          </w:p>
+        </w:tc>
+      </w:tr>
+      <w:tr>
+        <w:tc>
+          <w:tcPr/>
+          <w:p>
+            <w:pPr>
+              <w:pStyle w:val="Compact"/>
+            </w:pPr>
+            <w:r>
+              <w:t xml:space="preserve">Recorded source WAV used in primary video</w:t>
+            </w:r>
+          </w:p>
+        </w:tc>
+        <w:tc>
+          <w:tcPr/>
+          <w:p>
+            <w:pPr>
+              <w:pStyle w:val="Compact"/>
+            </w:pPr>
+            <w:r>
+              <w:rPr>
+                <w:rStyle w:val="VerbatimChar"/>
+              </w:rPr>
+              <w:t xml:space="preserve">artifacts/video_v21/recorded_voiceover/NoteGPT_Speech_1778252509802.wav</w:t>
+            </w:r>
+          </w:p>
+        </w:tc>
+      </w:tr>
+      <w:tr>
+        <w:tc>
+          <w:tcPr/>
+          <w:p>
+            <w:pPr>
+              <w:pStyle w:val="Compact"/>
+            </w:pPr>
+            <w:r>
+              <w:t xml:space="preserve">Recorded-voiceover key frames</w:t>
+            </w:r>
+          </w:p>
+        </w:tc>
+        <w:tc>
+          <w:tcPr/>
+          <w:p>
+            <w:pPr>
+              <w:pStyle w:val="Compact"/>
+            </w:pPr>
+            <w:r>
+              <w:rPr>
+                <w:rStyle w:val="VerbatimChar"/>
+              </w:rPr>
+              <w:t xml:space="preserve">artifacts/video_v21/recorded_voiceover_keyframes/*.png</w:t>
+            </w:r>
+          </w:p>
+        </w:tc>
+      </w:tr>
+      <w:tr>
+        <w:tc>
+          <w:tcPr/>
+          <w:p>
+            <w:pPr>
+              <w:pStyle w:val="Compact"/>
+            </w:pPr>
+            <w:r>
+              <w:t xml:space="preserve">Recorded-voiceover render CLI</w:t>
+            </w:r>
+          </w:p>
+        </w:tc>
+        <w:tc>
+          <w:tcPr/>
+          <w:p>
+            <w:pPr>
+              <w:pStyle w:val="Compact"/>
+            </w:pPr>
+            <w:r>
+              <w:rPr>
+                <w:rStyle w:val="VerbatimChar"/>
+              </w:rPr>
+              <w:t xml:space="preserve">python tools/render_recorded_voiceover_v21_video.py --voiceover artifacts/video_v21/recorded_voiceover/NoteGPT_Speech_1778252509802.wav</w:t>
+            </w:r>
           </w:p>
         </w:tc>
       </w:tr>

</xml_diff>